<commit_message>
Run all the notebooks
</commit_message>
<xml_diff>
--- a/paper/Euro2024_Sentiment_Paper.docx
+++ b/paper/Euro2024_Sentiment_Paper.docx
@@ -126,74 +126,6 @@
     </w:p>
     <w:p>
       <w:pPr>
-        <w:spacing w:after="200" w:line="276" w:lineRule="auto"/>
-        <w:jc w:val="center"/>
-      </w:pPr>
-      <w:r>
-        <w:rPr>
-          <w:i/>
-          <w:iCs/>
-          <w:sz w:val="18"/>
-          <w:szCs w:val="18"/>
-        </w:rPr>
-        <w:t xml:space="preserve">[DELETE BEFORE SUBMISSION: Target venues are Applied Sciences (MDPI) or </w:t>
-      </w:r>
-      <w:proofErr w:type="spellStart"/>
-      <w:r>
-        <w:rPr>
-          <w:i/>
-          <w:iCs/>
-          <w:sz w:val="18"/>
-          <w:szCs w:val="18"/>
-        </w:rPr>
-        <w:t>ArXiv</w:t>
-      </w:r>
-      <w:proofErr w:type="spellEnd"/>
-      <w:r>
-        <w:rPr>
-          <w:i/>
-          <w:iCs/>
-          <w:sz w:val="18"/>
-          <w:szCs w:val="18"/>
-        </w:rPr>
-        <w:t xml:space="preserve"> cs.CL. For MDPI, transfer content into their Word template from mdpi.com/authors/word. For </w:t>
-      </w:r>
-      <w:proofErr w:type="spellStart"/>
-      <w:r>
-        <w:rPr>
-          <w:i/>
-          <w:iCs/>
-          <w:sz w:val="18"/>
-          <w:szCs w:val="18"/>
-        </w:rPr>
-        <w:t>ArXiv</w:t>
-      </w:r>
-      <w:proofErr w:type="spellEnd"/>
-      <w:r>
-        <w:rPr>
-          <w:i/>
-          <w:iCs/>
-          <w:sz w:val="18"/>
-          <w:szCs w:val="18"/>
-        </w:rPr>
-        <w:t>, convert to PDF and upload directly.]</w:t>
-      </w:r>
-    </w:p>
-    <w:p>
-      <w:pPr>
-        <w:pBdr>
-          <w:bottom w:val="single" w:sz="6" w:space="1" w:color="CCCCCC"/>
-        </w:pBdr>
-      </w:pPr>
-    </w:p>
-    <w:p>
-      <w:pPr>
-        <w:spacing w:line="276" w:lineRule="auto"/>
-        <w:jc w:val="both"/>
-      </w:pPr>
-    </w:p>
-    <w:p>
-      <w:pPr>
         <w:spacing w:after="80" w:line="276" w:lineRule="auto"/>
         <w:jc w:val="both"/>
       </w:pPr>
@@ -219,7 +151,25 @@
       </w:r>
       <w:proofErr w:type="spellEnd"/>
       <w:r>
-        <w:t xml:space="preserve"> benchmark dataset (Barbieri et al., 2020; N = 57,763), evaluate VADER as a rule-based comparison, and apply Claude Haiku as a zero-shot LLM classifier with a domain-adapted prompt. All four models are applied to a corpus of 871 tweets from the tournament’s final stages (July 7–21, 2024), covering England’s semi-final victory over the Netherlands (2–1) and final defeat to Spain (1–2). The binary Logistic Regression achieves the strongest benchmark performance (accuracy = 0.862, AUC = 0.927), outperforming VADER (accuracy = 0.778) and the three-class extension (accuracy = 0.646). However, in domain-level analysis, only Claude Haiku detects a statistically significant difference in public sentiment between match-win and match-loss days (t = 2.52, p = .012), while classical approaches fail to reach significance. Analysis of model outputs reveals that 79.2% of tournament tweets are classified as neutral by the LLM — substantially higher than classical estimates — suggesting that football Twitter is predominantly informational rather than emotionally charged. Cross-model agreement of 81.3% provides convergent validity for the observed sentiment pattern. These findings demonstrate that benchmark accuracy and domain sensitivity are dissociable properties of sentiment classifiers, with important implications for sports analytics and social media NLP.</w:t>
+        <w:t xml:space="preserve"> benchmark dataset (Barbieri et al., 2020; N = 57,763), evaluate VADER as a rule-based comparison, and apply Claude Haiku as a zero-shot LLM classifier with a domain-adapted prompt. All four models are applied to a corpus of 871 tweets from the tournament’s final stages (July 7</w:t>
+      </w:r>
+      <w:r>
+        <w:t>--</w:t>
+      </w:r>
+      <w:r>
+        <w:t>21, 2024), covering England’s semi-final victory over the Netherlands (2</w:t>
+      </w:r>
+      <w:r>
+        <w:t>--</w:t>
+      </w:r>
+      <w:r>
+        <w:t>1) and final defeat to Spain (1</w:t>
+      </w:r>
+      <w:r>
+        <w:t>--</w:t>
+      </w:r>
+      <w:r>
+        <w:t>2). The binary Logistic Regression achieves the strongest benchmark performance (accuracy = 0.862, AUC = 0.927), outperforming VADER (accuracy = 0.778) and the three-class extension (accuracy = 0.646). However, in domain-level analysis, only Claude Haiku detects a statistically significant difference in public sentiment between match-win and match-loss days (t = 2.52, p = .012), while classical approaches fail to reach significance. Analysis of model outputs reveals that 79.2% of tournament tweets are classified as neutral by the LLM — substantially higher than classical estimates — suggesting that football Twitter is predominantly informational rather than emotionally charged. Cross-model agreement of 81.3% provides convergent validity for the observed sentiment pattern. These findings demonstrate that benchmark accuracy and domain sensitivity are dissociable properties of sentiment classifiers, with important implications for sports analytics and social media NLP.</w:t>
       </w:r>
     </w:p>
     <w:p>
@@ -255,7 +205,6 @@
           <w:b/>
           <w:bCs/>
         </w:rPr>
-        <w:lastRenderedPageBreak/>
         <w:t>1. Introduction</w:t>
       </w:r>
     </w:p>
@@ -266,7 +215,17 @@
         <w:jc w:val="both"/>
       </w:pPr>
       <w:r>
-        <w:t>The proliferation of social media platforms has created vast repositories of real-time public opinion data. Sport, and football in particular, represents one of the most emotionally charged domains of social media discourse, generating millions of posts around major competitions. The UEFA European Championship provides a natural experiment for studying sentiment–outcome relationships: emotional stakes are high, events are time-stamped, and match outcomes are binary and unambiguous.</w:t>
+        <w:t xml:space="preserve">The proliferation of social media platforms has created vast repositories of real-time public opinion data. Sport, and football in particular, represents one of the most emotionally charged </w:t>
+      </w:r>
+      <w:r>
+        <w:lastRenderedPageBreak/>
+        <w:t>domains of social media discourse, generating millions of posts around major competitions. The UEFA European Championship provides a natural experiment for studying sentiment</w:t>
+      </w:r>
+      <w:r>
+        <w:t>--</w:t>
+      </w:r>
+      <w:r>
+        <w:t>outcome relationships: emotional stakes are high, events are time-stamped, and match outcomes are binary and unambiguous.</w:t>
       </w:r>
     </w:p>
     <w:p>
@@ -378,7 +337,6 @@
           <w:i/>
           <w:iCs/>
         </w:rPr>
-        <w:lastRenderedPageBreak/>
         <w:t>2.3 LLMs for Zero-Shot Classification</w:t>
       </w:r>
     </w:p>
@@ -389,6 +347,7 @@
         <w:jc w:val="both"/>
       </w:pPr>
       <w:r>
+        <w:lastRenderedPageBreak/>
         <w:t>Brown et al. (2020) demonstrated that large language models can perform classification in a zero-shot or few-shot manner without task-specific training. Subsequent work has found that LLMs underperform fine-tuned models on general benchmarks but can match or exceed them on domain-specific tasks where training data is scarce (Agrawal et al., 2022). Our study contributes to this literature by showing that domain-adapted zero-shot LLM prompting achieves statistical sensitivity that classical models cannot replicate on a limited-size domain corpus.</w:t>
       </w:r>
     </w:p>
@@ -457,7 +416,13 @@
         <w:jc w:val="both"/>
       </w:pPr>
       <w:r>
-        <w:t>The domain corpus consists of 871 English-language tweets collected during UEFA Euro 2024 (July 7–21, 2024) via the APIFY Twitter Search Scraper, targeting hashtags including #ThreeLions, #England, and #EURO2024. Preprocessing removed duplicates, non-English content, spam, and tweets with fewer than four tokens. Days with fewer than five tweets were excluded from temporal analyses to avoid single-tweet artefacts.</w:t>
+        <w:t>The domain corpus consists of 871 English-language tweets collected during UEFA Euro 2024 (July 7</w:t>
+      </w:r>
+      <w:r>
+        <w:t>--</w:t>
+      </w:r>
+      <w:r>
+        <w:t>21, 2024) via the APIFY Twitter Search Scraper, targeting hashtags including #ThreeLions, #England, and #EURO2024. Preprocessing removed duplicates, non-English content, spam, and tweets with fewer than four tokens. Days with fewer than five tweets were excluded from temporal analyses to avoid single-tweet artefacts.</w:t>
       </w:r>
     </w:p>
     <w:p>
@@ -614,12 +579,6 @@
         <w:gridCol w:w="1860"/>
       </w:tblGrid>
       <w:tr>
-        <w:tblPrEx>
-          <w:tblCellMar>
-            <w:top w:w="0" w:type="dxa"/>
-            <w:bottom w:w="0" w:type="dxa"/>
-          </w:tblCellMar>
-        </w:tblPrEx>
         <w:trPr>
           <w:tblHeader/>
         </w:trPr>
@@ -753,12 +712,6 @@
         </w:tc>
       </w:tr>
       <w:tr>
-        <w:tblPrEx>
-          <w:tblCellMar>
-            <w:top w:w="0" w:type="dxa"/>
-            <w:bottom w:w="0" w:type="dxa"/>
-          </w:tblCellMar>
-        </w:tblPrEx>
         <w:tc>
           <w:tcPr>
             <w:tcW w:w="3800" w:type="dxa"/>
@@ -874,12 +827,6 @@
         </w:tc>
       </w:tr>
       <w:tr>
-        <w:tblPrEx>
-          <w:tblCellMar>
-            <w:top w:w="0" w:type="dxa"/>
-            <w:bottom w:w="0" w:type="dxa"/>
-          </w:tblCellMar>
-        </w:tblPrEx>
         <w:tc>
           <w:tcPr>
             <w:tcW w:w="3800" w:type="dxa"/>
@@ -995,12 +942,6 @@
         </w:tc>
       </w:tr>
       <w:tr>
-        <w:tblPrEx>
-          <w:tblCellMar>
-            <w:top w:w="0" w:type="dxa"/>
-            <w:bottom w:w="0" w:type="dxa"/>
-          </w:tblCellMar>
-        </w:tblPrEx>
         <w:tc>
           <w:tcPr>
             <w:tcW w:w="3800" w:type="dxa"/>
@@ -1116,12 +1057,6 @@
         </w:tc>
       </w:tr>
       <w:tr>
-        <w:tblPrEx>
-          <w:tblCellMar>
-            <w:top w:w="0" w:type="dxa"/>
-            <w:bottom w:w="0" w:type="dxa"/>
-          </w:tblCellMar>
-        </w:tblPrEx>
         <w:tc>
           <w:tcPr>
             <w:tcW w:w="3800" w:type="dxa"/>
@@ -1316,12 +1251,6 @@
         <w:gridCol w:w="1041"/>
       </w:tblGrid>
       <w:tr>
-        <w:tblPrEx>
-          <w:tblCellMar>
-            <w:top w:w="0" w:type="dxa"/>
-            <w:bottom w:w="0" w:type="dxa"/>
-          </w:tblCellMar>
-        </w:tblPrEx>
         <w:trPr>
           <w:tblHeader/>
         </w:trPr>
@@ -1551,12 +1480,6 @@
         </w:tc>
       </w:tr>
       <w:tr>
-        <w:tblPrEx>
-          <w:tblCellMar>
-            <w:top w:w="0" w:type="dxa"/>
-            <w:bottom w:w="0" w:type="dxa"/>
-          </w:tblCellMar>
-        </w:tblPrEx>
         <w:tc>
           <w:tcPr>
             <w:tcW w:w="2300" w:type="dxa"/>
@@ -1759,12 +1682,6 @@
         </w:tc>
       </w:tr>
       <w:tr>
-        <w:tblPrEx>
-          <w:tblCellMar>
-            <w:top w:w="0" w:type="dxa"/>
-            <w:bottom w:w="0" w:type="dxa"/>
-          </w:tblCellMar>
-        </w:tblPrEx>
         <w:tc>
           <w:tcPr>
             <w:tcW w:w="2300" w:type="dxa"/>
@@ -1967,12 +1884,6 @@
         </w:tc>
       </w:tr>
       <w:tr>
-        <w:tblPrEx>
-          <w:tblCellMar>
-            <w:top w:w="0" w:type="dxa"/>
-            <w:bottom w:w="0" w:type="dxa"/>
-          </w:tblCellMar>
-        </w:tblPrEx>
         <w:tc>
           <w:tcPr>
             <w:tcW w:w="2300" w:type="dxa"/>
@@ -2175,12 +2086,6 @@
         </w:tc>
       </w:tr>
       <w:tr>
-        <w:tblPrEx>
-          <w:tblCellMar>
-            <w:top w:w="0" w:type="dxa"/>
-            <w:bottom w:w="0" w:type="dxa"/>
-          </w:tblCellMar>
-        </w:tblPrEx>
         <w:tc>
           <w:tcPr>
             <w:tcW w:w="2300" w:type="dxa"/>
@@ -2401,7 +2306,43 @@
           <w:sz w:val="20"/>
           <w:szCs w:val="20"/>
         </w:rPr>
-        <w:t>Note. Win: England 2–1 Netherlands (SF, 75 tweets). Loss: England 1–2 Spain (Final, 254 tweets). Welch’s t-test. Δ = Win − Loss.</w:t>
+        <w:t>Note. Win: England 2</w:t>
+      </w:r>
+      <w:r>
+        <w:rPr>
+          <w:i/>
+          <w:iCs/>
+          <w:sz w:val="20"/>
+          <w:szCs w:val="20"/>
+        </w:rPr>
+        <w:t>--</w:t>
+      </w:r>
+      <w:r>
+        <w:rPr>
+          <w:i/>
+          <w:iCs/>
+          <w:sz w:val="20"/>
+          <w:szCs w:val="20"/>
+        </w:rPr>
+        <w:t>1 Netherlands (SF, 75 tweets). Loss: England 1</w:t>
+      </w:r>
+      <w:r>
+        <w:rPr>
+          <w:i/>
+          <w:iCs/>
+          <w:sz w:val="20"/>
+          <w:szCs w:val="20"/>
+        </w:rPr>
+        <w:t>--</w:t>
+      </w:r>
+      <w:r>
+        <w:rPr>
+          <w:i/>
+          <w:iCs/>
+          <w:sz w:val="20"/>
+          <w:szCs w:val="20"/>
+        </w:rPr>
+        <w:t>2 Spain (Final, 254 tweets). Welch’s t-test. Δ = Win − Loss.</w:t>
       </w:r>
     </w:p>
     <w:p>
@@ -2624,7 +2565,13 @@
       </w:r>
       <w:r>
         <w:lastRenderedPageBreak/>
-        <w:t>Association for Computational Linguistics: EMNLP 2020 (pp. 1644–1650). https://aclanthology.org/2020.findings-emnlp.148</w:t>
+        <w:t>Association for Computational Linguistics: EMNLP 2020 (pp. 1644</w:t>
+      </w:r>
+      <w:r>
+        <w:t>--</w:t>
+      </w:r>
+      <w:r>
+        <w:t>1650). https://aclanthology.org/2020.findings-emnlp.148</w:t>
       </w:r>
     </w:p>
     <w:p>
@@ -2633,7 +2580,13 @@
         <w:ind w:left="720" w:hanging="720"/>
       </w:pPr>
       <w:r>
-        <w:t>Brown, T. B., Mann, B., Ryder, N., Subbiah, M., Kaplan, J., Dhariwal, P., &amp; Amodei, D. (2020). Language models are few-shot learners. Advances in Neural Information Processing Systems, 33, 1877–1901.</w:t>
+        <w:t>Brown, T. B., Mann, B., Ryder, N., Subbiah, M., Kaplan, J., Dhariwal, P., &amp; Amodei, D. (2020). Language models are few-shot learners. Advances in Neural Information Processing Systems, 33, 1877</w:t>
+      </w:r>
+      <w:r>
+        <w:t>--</w:t>
+      </w:r>
+      <w:r>
+        <w:t>1901.</w:t>
       </w:r>
     </w:p>
     <w:p>
@@ -2668,7 +2621,13 @@
       </w:r>
       <w:proofErr w:type="gramEnd"/>
       <w:r>
-        <w:t xml:space="preserve"> (pp. 216–225).</w:t>
+        <w:t xml:space="preserve"> (pp. 216</w:t>
+      </w:r>
+      <w:r>
+        <w:t>--</w:t>
+      </w:r>
+      <w:r>
+        <w:t>225).</w:t>
       </w:r>
     </w:p>
     <w:p>
@@ -2685,7 +2644,13 @@
       </w:r>
       <w:proofErr w:type="spellEnd"/>
       <w:r>
-        <w:t>: A pre-trained language model for English tweets. In Proceedings of the 2020 Conference on Empirical Methods in Natural Language Processing: System Demonstrations (pp. 9–14). https://arxiv.org/abs/2005.10200</w:t>
+        <w:t>: A pre-trained language model for English tweets. In Proceedings of the 2020 Conference on Empirical Methods in Natural Language Processing: System Demonstrations (pp. 9</w:t>
+      </w:r>
+      <w:r>
+        <w:t>--</w:t>
+      </w:r>
+      <w:r>
+        <w:t>14). https://arxiv.org/abs/2005.10200</w:t>
       </w:r>
     </w:p>
     <w:p>
@@ -2710,7 +2675,13 @@
       </w:r>
       <w:proofErr w:type="gramEnd"/>
       <w:r>
-        <w:t xml:space="preserve"> (pp. 122–129).</w:t>
+        <w:t xml:space="preserve"> (pp. 122</w:t>
+      </w:r>
+      <w:r>
+        <w:t>--</w:t>
+      </w:r>
+      <w:r>
+        <w:t>129).</w:t>
       </w:r>
     </w:p>
     <w:sectPr>

</xml_diff>